<commit_message>
docs: finalize E-RECORD 5.docx with links, architecture diagram, and screenshots
</commit_message>
<xml_diff>
--- a/E-RECORD 5.docx
+++ b/E-RECORD 5.docx
@@ -135,23 +135,8 @@
             <w:vAlign w:val="center"/>
           </w:tcPr>
           <w:p>
-            <w:pPr>
-              <w:pStyle w:val="TableParagraph"/>
-              <w:spacing w:line="321" w:lineRule="exact"/>
-              <w:ind w:left="12"/>
-              <w:jc w:val="center"/>
-              <w:rPr>
-                <w:b/>
-                <w:sz w:val="28"/>
-              </w:rPr>
-            </w:pPr>
             <w:r>
-              <w:rPr>
-                <w:b/>
-                <w:spacing w:val="-2"/>
-                <w:sz w:val="28"/>
-              </w:rPr>
-              <w:t>&lt;DATE&gt;</w:t>
+              <w:t>22-10-2026</w:t>
             </w:r>
           </w:p>
         </w:tc>
@@ -916,19 +901,51 @@
         <w:t>System Architecture</w:t>
       </w:r>
     </w:p>
+    <w:p/>
     <w:p>
       <w:pPr>
         <w:pStyle w:val="NormalWeb"/>
         <w:ind w:left="165"/>
       </w:pPr>
       <w:r>
-        <w:t>&lt;</w:t>
-      </w:r>
-      <w:r>
-        <w:t>Students should insert the architecture diagram.</w:t>
-      </w:r>
-      <w:r>
-        <w:t>&gt;</w:t>
+        <w:t>System Architecture Diagram:</w:t>
+      </w:r>
+      <w:r>
+        <w:br/>
+      </w:r>
+      <w:r>
+        <w:drawing>
+          <wp:inline xmlns:a="http://schemas.openxmlformats.org/drawingml/2006/main" xmlns:pic="http://schemas.openxmlformats.org/drawingml/2006/picture">
+            <wp:extent cx="5486400" cy="3546764"/>
+            <wp:docPr id="1" name="Picture 1"/>
+            <wp:cNvGraphicFramePr>
+              <a:graphicFrameLocks noChangeAspect="1"/>
+            </wp:cNvGraphicFramePr>
+            <a:graphic>
+              <a:graphicData uri="http://schemas.openxmlformats.org/drawingml/2006/picture">
+                <pic:pic>
+                  <pic:nvPicPr>
+                    <pic:cNvPr id="0" name="Architecture Diagram.png"/>
+                    <pic:cNvPicPr/>
+                  </pic:nvPicPr>
+                  <pic:blipFill>
+                    <a:blip r:embed="rId11"/>
+                    <a:stretch>
+                      <a:fillRect/>
+                    </a:stretch>
+                  </pic:blipFill>
+                  <pic:spPr>
+                    <a:xfrm>
+                      <a:off x="0" y="0"/>
+                      <a:ext cx="5486400" cy="3546764"/>
+                    </a:xfrm>
+                    <a:prstGeom prst="rect"/>
+                  </pic:spPr>
+                </pic:pic>
+              </a:graphicData>
+            </a:graphic>
+          </wp:inline>
+        </w:drawing>
       </w:r>
     </w:p>
     <w:p>
@@ -1078,13 +1095,9 @@
             <w:vAlign w:val="center"/>
           </w:tcPr>
           <w:p>
-            <w:pPr>
-              <w:rPr>
-                <w:sz w:val="24"/>
-                <w:szCs w:val="24"/>
-                <w:lang w:eastAsia="en-IN"/>
-              </w:rPr>
-            </w:pPr>
+            <w:r>
+              <w:t>Accepts legal contracts via manual keyboard typing, local file uploads (.txt, .pdf), or preloaded sample agreements; displays clean document metadata cards.</w:t>
+            </w:r>
           </w:p>
         </w:tc>
       </w:tr>
@@ -1122,13 +1135,9 @@
             <w:vAlign w:val="center"/>
           </w:tcPr>
           <w:p>
-            <w:pPr>
-              <w:rPr>
-                <w:sz w:val="24"/>
-                <w:szCs w:val="24"/>
-                <w:lang w:eastAsia="en-IN"/>
-              </w:rPr>
-            </w:pPr>
+            <w:r>
+              <w:t>Parses raw textual content from plain text and PDF documents using pypdf with multi-encoding fallback; computes word, character, and page metrics.</w:t>
+            </w:r>
           </w:p>
         </w:tc>
       </w:tr>
@@ -1166,13 +1175,9 @@
             <w:vAlign w:val="center"/>
           </w:tcPr>
           <w:p>
-            <w:pPr>
-              <w:rPr>
-                <w:sz w:val="24"/>
-                <w:szCs w:val="24"/>
-                <w:lang w:eastAsia="en-IN"/>
-              </w:rPr>
-            </w:pPr>
+            <w:r>
+              <w:t>Normalizes text, strips unwanted control characters, removes redundant whitespace, extracts contract clauses into a structured Pandas DataFrame, and partitions large documents into semantic chunks.</w:t>
+            </w:r>
           </w:p>
         </w:tc>
       </w:tr>
@@ -1210,13 +1215,9 @@
             <w:vAlign w:val="center"/>
           </w:tcPr>
           <w:p>
-            <w:pPr>
-              <w:rPr>
-                <w:sz w:val="24"/>
-                <w:szCs w:val="24"/>
-                <w:lang w:eastAsia="en-IN"/>
-              </w:rPr>
-            </w:pPr>
+            <w:r>
+              <w:t>Constructs domain-specific prompts with legal assistant personas, strict anti-hallucination guardrails ('If information is not available, state Not mentioned in the document'), and structured output schemas.</w:t>
+            </w:r>
           </w:p>
         </w:tc>
       </w:tr>
@@ -1255,13 +1256,9 @@
             <w:vAlign w:val="center"/>
           </w:tcPr>
           <w:p>
-            <w:pPr>
-              <w:rPr>
-                <w:sz w:val="24"/>
-                <w:szCs w:val="24"/>
-                <w:lang w:eastAsia="en-IN"/>
-              </w:rPr>
-            </w:pPr>
+            <w:r>
+              <w:t>Orchestrates inference using local Ollama LLMs (llama3.2 / qwen2.5) or OpenAI GPT-4, parses extracted fields (parties, purpose, duration, obligations, payments, termination, dates, clauses, summary), and persists reports to disk.</w:t>
+            </w:r>
           </w:p>
         </w:tc>
       </w:tr>
@@ -1287,7 +1284,9 @@
         <w:spacing w:before="0" w:beforeAutospacing="0" w:after="0" w:afterAutospacing="0"/>
       </w:pPr>
       <w:r>
-        <w:t>&lt;GitHub Link&gt;</w:t>
+        <w:t>GitHub Repository:</w:t>
+        <w:br/>
+        <w:t>https://github.com/DeepakKrishnanSU/Automated-Legal-Document-Analyzer-using-GPT-4</w:t>
       </w:r>
     </w:p>
     <w:p>
@@ -1296,7 +1295,9 @@
         <w:spacing w:before="0" w:beforeAutospacing="0" w:after="0" w:afterAutospacing="0"/>
       </w:pPr>
       <w:r>
-        <w:t>&lt;LinkedIn Post Link&gt;</w:t>
+        <w:t>LinkedIn Demo Post:</w:t>
+        <w:br/>
+        <w:t>https://lnkd.in/p/gUqgRXes</w:t>
       </w:r>
     </w:p>
     <w:p/>
@@ -1374,6 +1375,43 @@
         </w:rPr>
         <w:t>Home Screen</w:t>
       </w:r>
+      <w:r>
+        <w:br/>
+      </w:r>
+      <w:r>
+        <w:drawing>
+          <wp:inline xmlns:a="http://schemas.openxmlformats.org/drawingml/2006/main" xmlns:pic="http://schemas.openxmlformats.org/drawingml/2006/picture">
+            <wp:extent cx="5120640" cy="2679628"/>
+            <wp:docPr id="2" name="Picture 2"/>
+            <wp:cNvGraphicFramePr>
+              <a:graphicFrameLocks noChangeAspect="1"/>
+            </wp:cNvGraphicFramePr>
+            <a:graphic>
+              <a:graphicData uri="http://schemas.openxmlformats.org/drawingml/2006/picture">
+                <pic:pic>
+                  <pic:nvPicPr>
+                    <pic:cNvPr id="0" name="Home Screen.png"/>
+                    <pic:cNvPicPr/>
+                  </pic:nvPicPr>
+                  <pic:blipFill>
+                    <a:blip r:embed="rId12"/>
+                    <a:stretch>
+                      <a:fillRect/>
+                    </a:stretch>
+                  </pic:blipFill>
+                  <pic:spPr>
+                    <a:xfrm>
+                      <a:off x="0" y="0"/>
+                      <a:ext cx="5120640" cy="2679628"/>
+                    </a:xfrm>
+                    <a:prstGeom prst="rect"/>
+                  </pic:spPr>
+                </pic:pic>
+              </a:graphicData>
+            </a:graphic>
+          </wp:inline>
+        </w:drawing>
+      </w:r>
     </w:p>
     <w:p>
       <w:pPr>
@@ -1398,6 +1436,43 @@
         </w:rPr>
         <w:t>Legal Document Input</w:t>
       </w:r>
+      <w:r>
+        <w:br/>
+      </w:r>
+      <w:r>
+        <w:drawing>
+          <wp:inline xmlns:a="http://schemas.openxmlformats.org/drawingml/2006/main" xmlns:pic="http://schemas.openxmlformats.org/drawingml/2006/picture">
+            <wp:extent cx="5120640" cy="2718875"/>
+            <wp:docPr id="3" name="Picture 3"/>
+            <wp:cNvGraphicFramePr>
+              <a:graphicFrameLocks noChangeAspect="1"/>
+            </wp:cNvGraphicFramePr>
+            <a:graphic>
+              <a:graphicData uri="http://schemas.openxmlformats.org/drawingml/2006/picture">
+                <pic:pic>
+                  <pic:nvPicPr>
+                    <pic:cNvPr id="0" name="Legal Document Input.png"/>
+                    <pic:cNvPicPr/>
+                  </pic:nvPicPr>
+                  <pic:blipFill>
+                    <a:blip r:embed="rId13"/>
+                    <a:stretch>
+                      <a:fillRect/>
+                    </a:stretch>
+                  </pic:blipFill>
+                  <pic:spPr>
+                    <a:xfrm>
+                      <a:off x="0" y="0"/>
+                      <a:ext cx="5120640" cy="2718875"/>
+                    </a:xfrm>
+                    <a:prstGeom prst="rect"/>
+                  </pic:spPr>
+                </pic:pic>
+              </a:graphicData>
+            </a:graphic>
+          </wp:inline>
+        </w:drawing>
+      </w:r>
     </w:p>
     <w:p>
       <w:pPr>
@@ -1422,6 +1497,43 @@
         </w:rPr>
         <w:t>Document Text Extraction</w:t>
       </w:r>
+      <w:r>
+        <w:br/>
+      </w:r>
+      <w:r>
+        <w:drawing>
+          <wp:inline xmlns:a="http://schemas.openxmlformats.org/drawingml/2006/main" xmlns:pic="http://schemas.openxmlformats.org/drawingml/2006/picture">
+            <wp:extent cx="5120640" cy="2722574"/>
+            <wp:docPr id="4" name="Picture 4"/>
+            <wp:cNvGraphicFramePr>
+              <a:graphicFrameLocks noChangeAspect="1"/>
+            </wp:cNvGraphicFramePr>
+            <a:graphic>
+              <a:graphicData uri="http://schemas.openxmlformats.org/drawingml/2006/picture">
+                <pic:pic>
+                  <pic:nvPicPr>
+                    <pic:cNvPr id="0" name="Document Text Extraction.png"/>
+                    <pic:cNvPicPr/>
+                  </pic:nvPicPr>
+                  <pic:blipFill>
+                    <a:blip r:embed="rId14"/>
+                    <a:stretch>
+                      <a:fillRect/>
+                    </a:stretch>
+                  </pic:blipFill>
+                  <pic:spPr>
+                    <a:xfrm>
+                      <a:off x="0" y="0"/>
+                      <a:ext cx="5120640" cy="2722574"/>
+                    </a:xfrm>
+                    <a:prstGeom prst="rect"/>
+                  </pic:spPr>
+                </pic:pic>
+              </a:graphicData>
+            </a:graphic>
+          </wp:inline>
+        </w:drawing>
+      </w:r>
     </w:p>
     <w:p>
       <w:pPr>
@@ -1446,6 +1558,43 @@
         </w:rPr>
         <w:t>Preprocessed Text</w:t>
       </w:r>
+      <w:r>
+        <w:br/>
+      </w:r>
+      <w:r>
+        <w:drawing>
+          <wp:inline xmlns:a="http://schemas.openxmlformats.org/drawingml/2006/main" xmlns:pic="http://schemas.openxmlformats.org/drawingml/2006/picture">
+            <wp:extent cx="5120640" cy="2720340"/>
+            <wp:docPr id="5" name="Picture 5"/>
+            <wp:cNvGraphicFramePr>
+              <a:graphicFrameLocks noChangeAspect="1"/>
+            </wp:cNvGraphicFramePr>
+            <a:graphic>
+              <a:graphicData uri="http://schemas.openxmlformats.org/drawingml/2006/picture">
+                <pic:pic>
+                  <pic:nvPicPr>
+                    <pic:cNvPr id="0" name="Preprocessed Text.png"/>
+                    <pic:cNvPicPr/>
+                  </pic:nvPicPr>
+                  <pic:blipFill>
+                    <a:blip r:embed="rId15"/>
+                    <a:stretch>
+                      <a:fillRect/>
+                    </a:stretch>
+                  </pic:blipFill>
+                  <pic:spPr>
+                    <a:xfrm>
+                      <a:off x="0" y="0"/>
+                      <a:ext cx="5120640" cy="2720340"/>
+                    </a:xfrm>
+                    <a:prstGeom prst="rect"/>
+                  </pic:spPr>
+                </pic:pic>
+              </a:graphicData>
+            </a:graphic>
+          </wp:inline>
+        </w:drawing>
+      </w:r>
     </w:p>
     <w:p>
       <w:pPr>
@@ -1470,6 +1619,43 @@
         </w:rPr>
         <w:t>Prompt Generation</w:t>
       </w:r>
+      <w:r>
+        <w:br/>
+      </w:r>
+      <w:r>
+        <w:drawing>
+          <wp:inline xmlns:a="http://schemas.openxmlformats.org/drawingml/2006/main" xmlns:pic="http://schemas.openxmlformats.org/drawingml/2006/picture">
+            <wp:extent cx="5120640" cy="2689158"/>
+            <wp:docPr id="6" name="Picture 6"/>
+            <wp:cNvGraphicFramePr>
+              <a:graphicFrameLocks noChangeAspect="1"/>
+            </wp:cNvGraphicFramePr>
+            <a:graphic>
+              <a:graphicData uri="http://schemas.openxmlformats.org/drawingml/2006/picture">
+                <pic:pic>
+                  <pic:nvPicPr>
+                    <pic:cNvPr id="0" name="Prompt Generation.png"/>
+                    <pic:cNvPicPr/>
+                  </pic:nvPicPr>
+                  <pic:blipFill>
+                    <a:blip r:embed="rId16"/>
+                    <a:stretch>
+                      <a:fillRect/>
+                    </a:stretch>
+                  </pic:blipFill>
+                  <pic:spPr>
+                    <a:xfrm>
+                      <a:off x="0" y="0"/>
+                      <a:ext cx="5120640" cy="2689158"/>
+                    </a:xfrm>
+                    <a:prstGeom prst="rect"/>
+                  </pic:spPr>
+                </pic:pic>
+              </a:graphicData>
+            </a:graphic>
+          </wp:inline>
+        </w:drawing>
+      </w:r>
     </w:p>
     <w:p>
       <w:pPr>
@@ -1494,6 +1680,43 @@
         </w:rPr>
         <w:t>GPT-4 Response</w:t>
       </w:r>
+      <w:r>
+        <w:br/>
+      </w:r>
+      <w:r>
+        <w:drawing>
+          <wp:inline xmlns:a="http://schemas.openxmlformats.org/drawingml/2006/main" xmlns:pic="http://schemas.openxmlformats.org/drawingml/2006/picture">
+            <wp:extent cx="5120640" cy="2718875"/>
+            <wp:docPr id="7" name="Picture 7"/>
+            <wp:cNvGraphicFramePr>
+              <a:graphicFrameLocks noChangeAspect="1"/>
+            </wp:cNvGraphicFramePr>
+            <a:graphic>
+              <a:graphicData uri="http://schemas.openxmlformats.org/drawingml/2006/picture">
+                <pic:pic>
+                  <pic:nvPicPr>
+                    <pic:cNvPr id="0" name="GPT-4 Response.png"/>
+                    <pic:cNvPicPr/>
+                  </pic:nvPicPr>
+                  <pic:blipFill>
+                    <a:blip r:embed="rId17"/>
+                    <a:stretch>
+                      <a:fillRect/>
+                    </a:stretch>
+                  </pic:blipFill>
+                  <pic:spPr>
+                    <a:xfrm>
+                      <a:off x="0" y="0"/>
+                      <a:ext cx="5120640" cy="2718875"/>
+                    </a:xfrm>
+                    <a:prstGeom prst="rect"/>
+                  </pic:spPr>
+                </pic:pic>
+              </a:graphicData>
+            </a:graphic>
+          </wp:inline>
+        </w:drawing>
+      </w:r>
     </w:p>
     <w:p>
       <w:pPr>
@@ -1517,6 +1740,43 @@
           <w:lang w:eastAsia="en-IN"/>
         </w:rPr>
         <w:t>Legal Document Summary</w:t>
+      </w:r>
+      <w:r>
+        <w:br/>
+      </w:r>
+      <w:r>
+        <w:drawing>
+          <wp:inline xmlns:a="http://schemas.openxmlformats.org/drawingml/2006/main" xmlns:pic="http://schemas.openxmlformats.org/drawingml/2006/picture">
+            <wp:extent cx="5120640" cy="2710927"/>
+            <wp:docPr id="8" name="Picture 8"/>
+            <wp:cNvGraphicFramePr>
+              <a:graphicFrameLocks noChangeAspect="1"/>
+            </wp:cNvGraphicFramePr>
+            <a:graphic>
+              <a:graphicData uri="http://schemas.openxmlformats.org/drawingml/2006/picture">
+                <pic:pic>
+                  <pic:nvPicPr>
+                    <pic:cNvPr id="0" name="Legal Document Summary.png"/>
+                    <pic:cNvPicPr/>
+                  </pic:nvPicPr>
+                  <pic:blipFill>
+                    <a:blip r:embed="rId18"/>
+                    <a:stretch>
+                      <a:fillRect/>
+                    </a:stretch>
+                  </pic:blipFill>
+                  <pic:spPr>
+                    <a:xfrm>
+                      <a:off x="0" y="0"/>
+                      <a:ext cx="5120640" cy="2710927"/>
+                    </a:xfrm>
+                    <a:prstGeom prst="rect"/>
+                  </pic:spPr>
+                </pic:pic>
+              </a:graphicData>
+            </a:graphic>
+          </wp:inline>
+        </w:drawing>
       </w:r>
     </w:p>
     <w:p>

</xml_diff>